<commit_message>
lc-balance: sync BA Review en/zh (F2 buyer's usance re-characterized), drop stray unsuffixed docx
BA revised both TF-Balance-Component-BA-Review-{en,zh}.docx again: F2 (Export
Buyer's Usance) is re-characterized from an open business question to a settled
decision (Business-Rule-Decisions memo Decision 2, 2026-08-21) with only the
tenorRouting.ts/balanceService.ts guard still outstanding. The stray un-suffixed
English duplicate (which had the synced content while -en.docx was stale) has
been removed now that -en.docx carries the current content directly.

TODO.md/CLAUDE.md updated to match and to close out the file-naming discrepancy
noted earlier the same day.
</commit_message>
<xml_diff>
--- a/lc-balance/analysis/TF-Balance-Component-BA-Review-en.docx
+++ b/lc-balance/analysis/TF-Balance-Component-BA-Review-en.docx
@@ -77,6 +77,62 @@
     </w:p>
     <w:p>
       <w:pPr>
+        <w:pBdr>
+          <w:left w:val="single" w:color="C0793A" w:sz="18" w:space="8"/>
+        </w:pBdr>
+        <w:shd w:fill="F2E9DC" w:val="clear"/>
+        <w:spacing w:after="260" w:before="60"/>
+        <w:ind w:left="120"/>
+      </w:pPr>
+      <w:r>
+        <w:rPr>
+          <w:b/>
+          <w:bCs/>
+          <w:color w:val="7A4A18"/>
+          <w:sz w:val="19"/>
+          <w:szCs w:val="19"/>
+        </w:rPr>
+        <w:t xml:space="preserve">Revision note (25 August 2026)  </w:t>
+      </w:r>
+      <w:r>
+        <w:rPr>
+          <w:color w:val="5A3A14"/>
+          <w:sz w:val="19"/>
+          <w:szCs w:val="19"/>
+        </w:rPr>
+        <w:t xml:space="preserve">An earlier draft of this review flagged the Folio 3/5 "shadow memo" labeling of Acceptance/DPU GL effects as contradicting the taxonomy's ON_BALANCE_LIABILITY classification (originally finding F2). On further verification against the source knowledge base — ifrs-9-contingent-to-actual-reclassification-boundary.md, exposurenature-actual-tagging-for-acceptance-dpu.md, and on-balance-sheet-asset-instruments-are-out-of-balance-component-s-cont.md — this is confirmed not to be a defect: the component's own domain model already tags an Acceptance/DPU exposure exposureNature = ACTUAL once a draft is accepted, and the actual on-balance-sheet booking is intentionally excluded from this component's scope, the same way EBL/IBL financing is. See the added strength in Section 3 for the corrected explanation. This finding has been withdrawn and the remaining findings renumbered accordingly (16 findings → 15).</w:t>
+      </w:r>
+    </w:p>
+    <w:p>
+      <w:pPr>
+        <w:pBdr>
+          <w:left w:val="single" w:color="C0793A" w:sz="18" w:space="8"/>
+        </w:pBdr>
+        <w:shd w:fill="F2E9DC" w:val="clear"/>
+        <w:spacing w:after="260" w:before="0"/>
+        <w:ind w:left="120"/>
+      </w:pPr>
+      <w:r>
+        <w:rPr>
+          <w:b/>
+          <w:bCs/>
+          <w:color w:val="7A4A18"/>
+          <w:sz w:val="19"/>
+          <w:szCs w:val="19"/>
+        </w:rPr>
+        <w:t xml:space="preserve">Revision note (25 August 2026) — Export Buyer's Usance (F2)  </w:t>
+      </w:r>
+      <w:r>
+        <w:rPr>
+          <w:color w:val="5A3A14"/>
+          <w:sz w:val="19"/>
+          <w:szCs w:val="19"/>
+        </w:rPr>
+        <w:t xml:space="preserve">The original framing of this finding characterized Export Buyer's Usance treatment as an open business question owned by the business side. That was inaccurate: the business decision was already made and recorded in the Business-Rule-Decisions memo (2026-08-21, Decision 2) — a Buyer's Usance carries no deferred-payment exposure of its own on the Export/Confirming Bank's balance sheet (that financing sits with the Issuing Bank on the Import side) and must be processed identically to Sight. What remains open is purely the code implementation of that already-confirmed decision (Action Item 3). The finding below has been rewritten accordingly — same severity, corrected framing.</w:t>
+      </w:r>
+    </w:p>
+    <w:p>
+      <w:pPr>
         <w:pStyle w:val="Heading1"/>
         <w:pBdr>
           <w:bottom w:val="single" w:color="1F3864" w:sz="6" w:space="4"/>
@@ -115,7 +171,7 @@
           <w:sz w:val="21"/>
           <w:szCs w:val="21"/>
         </w:rPr>
-        <w:t xml:space="preserve">From a business-analysis and accounting-correctness standpoint, two findings matter more than the rest and should be resolved before further build-out continues: the absence of any expiry / UCP 600 Art. 16(f) auto-release mechanism (F1), and a direct, self-documented contradiction between the decision tables and the taxonomy spec over whether Acceptances and DPUs sit on-balance-sheet or as a shadow memo (F2). Both are addressed in detail below. Everything else identified is either already correctly scoped out of the component, already flagged and gated by the engineering team, or a lower-severity maintainability item.</w:t>
+        <w:t xml:space="preserve">From a business-analysis and accounting-correctness standpoint, one finding stands above the rest and should be resolved before further build-out continues: the absence of any expiry / UCP 600 Art. 16(f) auto-release mechanism (F1) — addressed in detail below. Two other concerns raised in earlier drafts of this review were investigated further at the request of the engineering and business team and found to need correction rather than being genuine open questions: Acceptance/DPU treatment is correctly designed, not a defect (see the Revision Notes above and the corresponding strength in Section 3); and Export Buyer's Usance (F2) already has a settled business decision behind it (2026-08-21) — what remains is a real, still-unimplemented code gap, but it is an engineering task, not an open business question. Aside from F1 and F2, the remaining findings are either already correctly scoped out of the component, already flagged and gated by the engineering team, or lower-severity items.</w:t>
       </w:r>
     </w:p>
     <w:p>
@@ -127,7 +183,7 @@
           <w:sz w:val="21"/>
           <w:szCs w:val="21"/>
         </w:rPr>
-        <w:t xml:space="preserve">Sixteen findings are recorded: 4 High, 8 Medium, 4 Low. None are novel discoveries in the sense of catching the team unaware — the majority are already present in some form in the project's own open-issues register — but several (F2 and F3 especially) are BA-owned decisions that remain open and should not be allowed to default silently.</w:t>
+        <w:t xml:space="preserve">Fifteen findings are recorded: 3 High, 8 Medium, 4 Low. None are novel discoveries in the sense of catching the team unaware — the majority are already present in some form in the project's own open-issues register — but F2 especially should not be left ambiguous about who owns the next step: the decision is made, only the build is outstanding.</w:t>
       </w:r>
     </w:p>
     <w:p>
@@ -182,7 +238,7 @@
           <w:sz w:val="21"/>
           <w:szCs w:val="21"/>
         </w:rPr>
-        <w:t xml:space="preserve">The only structural note worth flagging is that the exposure-graph relationship that matters most for correctness — the link from an LC to its linked Shipping Guarantee and Acceptance — is application-layer only, with no database foreign key behind it (see F8). The boundary of what the component is responsible for is right; the boundary of what the schema enforces is slightly looser than the boundary of what the business rules assume.</w:t>
+        <w:t xml:space="preserve">The only structural note worth flagging is that the exposure-graph relationship that matters most for correctness — the link from an LC to its linked Shipping Guarantee and Acceptance — is application-layer only, with no database foreign key behind it (see F7). The boundary of what the component is responsible for is right; the boundary of what the schema enforces is slightly looser than the boundary of what the business rules assume.</w:t>
       </w:r>
     </w:p>
     <w:p>
@@ -287,6 +343,23 @@
           <w:szCs w:val="21"/>
         </w:rPr>
         <w:t xml:space="preserve">Maker-checker is real and broadly enforced, including on the Close and SG-redemption functions, with same-user release explicitly rejected — not just a UI-level control.</w:t>
+      </w:r>
+    </w:p>
+    <w:p>
+      <w:pPr>
+        <w:pStyle w:val="ListParagraph"/>
+        <w:numPr>
+          <w:ilvl w:val="0"/>
+          <w:numId w:val="2"/>
+        </w:numPr>
+        <w:spacing w:after="100" w:line="270"/>
+      </w:pPr>
+      <w:r>
+        <w:rPr>
+          <w:sz w:val="21"/>
+          <w:szCs w:val="21"/>
+        </w:rPr>
+        <w:t xml:space="preserve">Acceptance/DPU handling is correctly scoped: once a draft is accepted, the component's own domain model tags the resulting exposure exposureNature = ACTUAL (not CONTINGENT), correctly reflecting the shift from a contingent to a present, unconditional liability under IFRS 9. The actual on-balance-sheet booking of that liability and its matching receivable is — by design — excluded from this component (deriveContingentAccountEntry() returns null for the resulting on-balance-sheet asset instruments), mirroring the same boundary used for EBL/IBL discounted exposure, which sits with the Loan Component downstream. The Folio 3/5 "shadow memo" Dr/Cr pair is a reference-only MIS reconciliation display, not the accounting record, and nothing in the implementation mistakes it for one.</w:t>
       </w:r>
     </w:p>
     <w:p>
@@ -659,7 +732,7 @@
                 <w:sz w:val="18"/>
                 <w:szCs w:val="18"/>
               </w:rPr>
-              <w:t xml:space="preserve">Acceptance / DPU shown as shadow-memo, contradicting the taxonomy spec</w:t>
+              <w:t xml:space="preserve">Export Buyer's Usance routing gap — decision made, implementation still pending</w:t>
             </w:r>
           </w:p>
         </w:tc>
@@ -683,7 +756,7 @@
                 <w:sz w:val="17"/>
                 <w:szCs w:val="17"/>
               </w:rPr>
-              <w:t xml:space="preserve">11-Decision-Tables Folio 3 and Folio 5 label every Acceptance/DPU GL effect "shadow memo only," while the design workbook's own balance-taxonomy classifies ACCEPTANCE_DPU_OUTSTANDING as ON_BALANCE_LIABILITY. Neither rule set has a corresponding test citation in the traceability matrix.</w:t>
+              <w:t xml:space="preserve">The business question itself is already settled: Business-Rule-Decisions memo (2026-08-21), Decision 2, states plainly that a Buyer's Usance tenor is financing the Issuing Bank extends to the Applicant on the Import side only — from the Export/Confirming Bank's own balance-sheet perspective it carries no deferred-payment exposure and must be processed identically to Sight (B4 routes to HONOUR, never ACCEPT); tenorType: 'BUYERS_USANCE' is not a valid declaration for an EPLC_CONFIRMATION contract. What is still open is purely the code: Action Item 3 from that same memo (the reject/normalize guard in tenorRouting.ts / balanceService.ts) remains unimplemented as of the 2026-08-24 addendum — only the two affected test cases (export-case-2/4) were corrected at the test-data level (to SELLERS_USANCE), not the domain-layer guard itself.</w:t>
             </w:r>
           </w:p>
           <w:p>
@@ -698,7 +771,7 @@
                 <w:sz w:val="17"/>
                 <w:szCs w:val="17"/>
               </w:rPr>
-              <w:t xml:space="preserve">Acceptances and incurred DPUs are a present, unconditional obligation under IAS 32.11 / IFRS 9 3.1.1 and must sit on-balance-sheet, gross both sides. If the shadow-memo version is what actually gets built, the liability is understated exactly where accounting standards are strictest.</w:t>
+              <w:t xml:space="preserve">Today, if EPLC_CONFIRMATION is ever declared with tenorType = BUYERS_USANCE — via the UI or a direct API call — B4 will still fall through the existing "anything other than SIGHT routes to ACCEPT" logic and create an Acceptance Liability / Reimbursement Receivable pair that should not exist on the confirming bank's own books. This is a live accounting-correctness risk, not just a missing input-validation nicety.</w:t>
             </w:r>
           </w:p>
         </w:tc>
@@ -722,7 +795,7 @@
                 <w:sz w:val="18"/>
                 <w:szCs w:val="18"/>
               </w:rPr>
-              <w:t xml:space="preserve">This is a contradiction inside the specification itself, not a coding bug — resolve which document is authoritative with explicit accounting sign-off, then add the missing test coverage on whichever path is confirmed.</w:t>
+              <w:t xml:space="preserve">This is a fully specified engineering task, not a pending business decision — implement the reject/normalize guard exactly as Decision 2 already describes it. No further BA sign-off is needed before building it.</w:t>
             </w:r>
           </w:p>
         </w:tc>
@@ -784,7 +857,7 @@
                 <w:sz w:val="18"/>
                 <w:szCs w:val="18"/>
               </w:rPr>
-              <w:t xml:space="preserve">Export Buyer's Usance still not rejected or normalized</w:t>
+              <w:t xml:space="preserve">No production-grade authentication or authorization</w:t>
             </w:r>
           </w:p>
         </w:tc>
@@ -808,7 +881,7 @@
                 <w:sz w:val="17"/>
                 <w:szCs w:val="17"/>
               </w:rPr>
-              <w:t xml:space="preserve">Business-Rule-Decisions memo (2026-08-21), Action Item 3, still marked not done in the 2026-08-24 addendum. The TenorType enum carries no undertakingAvailability / financingStructure / fundingParty / availableWith / bankRole fields, and a code comment states Sellers'- and Buyers'-Usance "drive identical Balance mechanics."</w:t>
+              <w:t xml:space="preserve">Tracked by engineering as BAL-001 (blocker). createdBy / releasedBy / checkerId are client-supplied free text and are trusted as-is; maker/checker identity is currently demo values.</w:t>
             </w:r>
           </w:p>
           <w:p>
@@ -823,7 +896,7 @@
                 <w:sz w:val="17"/>
                 <w:szCs w:val="17"/>
               </w:rPr>
-              <w:t xml:space="preserve">Accounting is being routed off tenorType alone, which is exactly the pattern that hides the BU-B (REFINANCING_BANK) interbank leg behind what looks like an ordinary BU-A (self-funded) usance.</w:t>
+              <w:t xml:space="preserve">Every entry in the audit trail — who submitted, who released — is currently unverifiable. This alone should block any pilot involving real counterparties or amounts.</w:t>
             </w:r>
           </w:p>
         </w:tc>
@@ -847,7 +920,7 @@
                 <w:sz w:val="18"/>
                 <w:szCs w:val="18"/>
               </w:rPr>
-              <w:t xml:space="preserve">Close this out — either implement the reject/normalize rule the BA decision called for, or formally document a scope change. It is currently an open action item owned by the business side, not engineering.</w:t>
+              <w:t xml:space="preserve">Confirm this is on the critical path before go-live planning; not a BA-domain fix, but a hard sign-off gate.</w:t>
             </w:r>
           </w:p>
         </w:tc>
@@ -869,11 +942,11 @@
               <w:rPr>
                 <w:b/>
                 <w:bCs/>
-                <w:color w:val="C0504D"/>
-                <w:sz w:val="17"/>
-                <w:szCs w:val="17"/>
-              </w:rPr>
-              <w:t xml:space="preserve">HIGH</w:t>
+                <w:color w:val="E5A825"/>
+                <w:sz w:val="17"/>
+                <w:szCs w:val="17"/>
+              </w:rPr>
+              <w:t xml:space="preserve">MEDIUM</w:t>
             </w:r>
           </w:p>
           <w:p>
@@ -909,7 +982,7 @@
                 <w:sz w:val="18"/>
                 <w:szCs w:val="18"/>
               </w:rPr>
-              <w:t xml:space="preserve">No production-grade authentication or authorization</w:t>
+              <w:t xml:space="preserve">No beneficiary-consent gate before AMEND_DECREASE</w:t>
             </w:r>
           </w:p>
         </w:tc>
@@ -933,7 +1006,7 @@
                 <w:sz w:val="17"/>
                 <w:szCs w:val="17"/>
               </w:rPr>
-              <w:t xml:space="preserve">Tracked by engineering as BAL-001 (blocker). createdBy / releasedBy / checkerId are client-supplied free text and are trusted as-is; maker/checker identity is currently demo values.</w:t>
+              <w:t xml:space="preserve">KB Knowledge-Gaps GAP-004 — a Checker can release an amount decrease with zero consent evidence captured.</w:t>
             </w:r>
           </w:p>
           <w:p>
@@ -948,7 +1021,7 @@
                 <w:sz w:val="17"/>
                 <w:szCs w:val="17"/>
               </w:rPr>
-              <w:t xml:space="preserve">Every entry in the audit trail — who submitted, who released — is currently unverifiable. This alone should block any pilot involving real counterparties or amounts.</w:t>
+              <w:t xml:space="preserve">UCP 600 Art. 10(a)/(c) requires beneficiary consent to a decrease; without a captured reference, the ledger cannot demonstrate that consent existed if challenged.</w:t>
             </w:r>
           </w:p>
         </w:tc>
@@ -972,7 +1045,7 @@
                 <w:sz w:val="18"/>
                 <w:szCs w:val="18"/>
               </w:rPr>
-              <w:t xml:space="preserve">Confirm this is on the critical path before go-live planning; not a BA-domain fix, but a hard sign-off gate.</w:t>
+              <w:t xml:space="preserve">Add a consent-reference or waiver-capture field as a precondition to releasing AMEND_DECREASE.</w:t>
             </w:r>
           </w:p>
         </w:tc>
@@ -1034,7 +1107,7 @@
                 <w:sz w:val="18"/>
                 <w:szCs w:val="18"/>
               </w:rPr>
-              <w:t xml:space="preserve">No beneficiary-consent gate before AMEND_DECREASE</w:t>
+              <w:t xml:space="preserve">Shipping Guarantee compound-leg redemption still uses MIN(Document, SG)</w:t>
             </w:r>
           </w:p>
         </w:tc>
@@ -1058,7 +1131,7 @@
                 <w:sz w:val="17"/>
                 <w:szCs w:val="17"/>
               </w:rPr>
-              <w:t xml:space="preserve">KB Knowledge-Gaps GAP-004 — a Checker can release an amount decrease with zero consent evidence captured.</w:t>
+              <w:t xml:space="preserve">The standalone SG path (A9) was fixed to full, instrument-based redemption; the document-matched compound path (A3S) still computes sgRedeemAmount = MIN(Document Amount, SG Outstanding), framed in the Business-Rule-Decisions memo as a narrow, BA-approved exception.</w:t>
             </w:r>
           </w:p>
           <w:p>
@@ -1073,7 +1146,7 @@
                 <w:sz w:val="17"/>
                 <w:szCs w:val="17"/>
               </w:rPr>
-              <w:t xml:space="preserve">UCP 600 Art. 10(a)/(c) requires beneficiary consent to a decrease; without a captured reference, the ledger cannot demonstrate that consent existed if challenged.</w:t>
+              <w:t xml:space="preserve">SG discharge should be instrument-triggered (the carrier returning the original SG, a written release, or B/L surrender), never amount-derived — MIN() leaves an unclearable residual whenever the LC carries the usual ~110% SG uplift.</w:t>
             </w:r>
           </w:p>
         </w:tc>
@@ -1097,7 +1170,7 @@
                 <w:sz w:val="18"/>
                 <w:szCs w:val="18"/>
               </w:rPr>
-              <w:t xml:space="preserve">Add a consent-reference or waiver-capture field as a precondition to releasing AMEND_DECREASE.</w:t>
+              <w:t xml:space="preserve">Revisit once a genuine "carrier release" event source exists for the compound path; until then, document the residual-balance risk explicitly rather than leaving it implicit.</w:t>
             </w:r>
           </w:p>
         </w:tc>
@@ -1159,7 +1232,7 @@
                 <w:sz w:val="18"/>
                 <w:szCs w:val="18"/>
               </w:rPr>
-              <w:t xml:space="preserve">Shipping Guarantee compound-leg redemption still uses MIN(Document, SG)</w:t>
+              <w:t xml:space="preserve">No cross-currency / FX handling</w:t>
             </w:r>
           </w:p>
         </w:tc>
@@ -1183,7 +1256,7 @@
                 <w:sz w:val="17"/>
                 <w:szCs w:val="17"/>
               </w:rPr>
-              <w:t xml:space="preserve">The standalone SG path (A9) was fixed to full, instrument-based redemption; the document-matched compound path (A3S) still computes sgRedeemAmount = MIN(Document Amount, SG Outstanding), framed in the Business-Rule-Decisions memo as a narrow, BA-approved exception.</w:t>
+              <w:t xml:space="preserve">05-Tolerance-FX notes self-disclose that tolerance and balance logic are single-currency only — no revaluation trigger, no rate table, no consolidated or base-currency exposure view.</w:t>
             </w:r>
           </w:p>
           <w:p>
@@ -1198,7 +1271,7 @@
                 <w:sz w:val="17"/>
                 <w:szCs w:val="17"/>
               </w:rPr>
-              <w:t xml:space="preserve">SG discharge should be instrument-triggered (the carrier returning the original SG, a written release, or B/L surrender), never amount-derived — MIN() leaves an unclearable residual whenever the LC carries the usual ~110% SG uplift.</w:t>
+              <w:t xml:space="preserve">Import/export LC books are inherently multi-currency; without this, any consolidated exposure or limit-utilisation figure has to be assembled entirely outside the component.</w:t>
             </w:r>
           </w:p>
         </w:tc>
@@ -1222,7 +1295,7 @@
                 <w:sz w:val="18"/>
                 <w:szCs w:val="18"/>
               </w:rPr>
-              <w:t xml:space="preserve">Revisit once a genuine "carrier release" event source exists for the compound path; until then, document the residual-balance risk explicitly rather than leaving it implicit.</w:t>
+              <w:t xml:space="preserve">Confirm in writing whether FX consolidation is intentionally a downstream responsibility. If not, scope it in before go-live.</w:t>
             </w:r>
           </w:p>
         </w:tc>
@@ -1284,7 +1357,7 @@
                 <w:sz w:val="18"/>
                 <w:szCs w:val="18"/>
               </w:rPr>
-              <w:t xml:space="preserve">No cross-currency / FX handling</w:t>
+              <w:t xml:space="preserve">Cross-instrument exposure aggregation has no general safeguard</w:t>
             </w:r>
           </w:p>
         </w:tc>
@@ -1308,7 +1381,7 @@
                 <w:sz w:val="17"/>
                 <w:szCs w:val="17"/>
               </w:rPr>
-              <w:t xml:space="preserve">05-Tolerance-FX notes self-disclose that tolerance and balance logic are single-currency only — no revaluation trigger, no rate table, no consolidated or base-currency exposure view.</w:t>
+              <w:t xml:space="preserve">Each function hardcodes its own netting sequence (subtract-then-add) rather than calling a shared MAX-based aggregator; parent_logical_contract_id (the LC ↔ SG/Acceptance link) is an application-layer relationship only, with no foreign key enforcing it.</w:t>
             </w:r>
           </w:p>
           <w:p>
@@ -1323,7 +1396,7 @@
                 <w:sz w:val="17"/>
                 <w:szCs w:val="17"/>
               </w:rPr>
-              <w:t xml:space="preserve">Import/export LC books are inherently multi-currency; without this, any consolidated exposure or limit-utilisation figure has to be assembled entirely outside the component.</w:t>
+              <w:t xml:space="preserve">The LC+SG+Acceptance exposure is correctly netted today, but only because the sequencing lives in scattered, per-function logic. Nothing in the schema stops a future report or consumer from naively summing raw balances across a linked contract family and double-counting.</w:t>
             </w:r>
           </w:p>
         </w:tc>
@@ -1347,7 +1420,7 @@
                 <w:sz w:val="18"/>
                 <w:szCs w:val="18"/>
               </w:rPr>
-              <w:t xml:space="preserve">Confirm in writing whether FX consolidation is intentionally a downstream responsibility. If not, scope it in before go-live.</w:t>
+              <w:t xml:space="preserve">Add either a DB-level FK on parent_logical_contract_id or an explicit "never SUM across a linked-contract tree" helper/guardrail before any new consumer is built on this data.</w:t>
             </w:r>
           </w:p>
         </w:tc>
@@ -1409,7 +1482,7 @@
                 <w:sz w:val="18"/>
                 <w:szCs w:val="18"/>
               </w:rPr>
-              <w:t xml:space="preserve">Cross-instrument exposure aggregation has no general safeguard</w:t>
+              <w:t xml:space="preserve">Direction is encoded two different ways</w:t>
             </w:r>
           </w:p>
         </w:tc>
@@ -1433,7 +1506,7 @@
                 <w:sz w:val="17"/>
                 <w:szCs w:val="17"/>
               </w:rPr>
-              <w:t xml:space="preserve">Each function hardcodes its own netting sequence (subtract-then-add) rather than calling a shared MAX-based aggregator; parent_logical_contract_id (the LC ↔ SG/Acceptance link) is an application-layer relationship only, with no foreign key enforcing it.</w:t>
+              <w:t xml:space="preserve">Most instruments derive direction from movementType via a static lookup table; B2 (EPLC_CONFIRMATION / AMEND) instead derives direction from the sign of the amount field itself — already a documented source of one real bug (a sign-negation patch that mutated the shared model object).</w:t>
             </w:r>
           </w:p>
           <w:p>
@@ -1448,7 +1521,7 @@
                 <w:sz w:val="17"/>
                 <w:szCs w:val="17"/>
               </w:rPr>
-              <w:t xml:space="preserve">The LC+SG+Acceptance exposure is correctly netted today, but only because the sequencing lives in scattered, per-function logic. Nothing in the schema stops a future report or consumer from naively summing raw balances across a linked contract family and double-counting.</w:t>
+              <w:t xml:space="preserve">Two mechanisms for the same concept increase the risk of the direction and the magnitude drifting out of sync, and make the rule harder to audit.</w:t>
             </w:r>
           </w:p>
         </w:tc>
@@ -1472,7 +1545,7 @@
                 <w:sz w:val="18"/>
                 <w:szCs w:val="18"/>
               </w:rPr>
-              <w:t xml:space="preserve">Add either a DB-level FK on parent_logical_contract_id or an explicit "never SUM across a linked-contract tree" helper/guardrail before any new consumer is built on this data.</w:t>
+              <w:t xml:space="preserve">Standardize on one direction mechanism, or document the B2 exception prominently at the API-contract level.</w:t>
             </w:r>
           </w:p>
         </w:tc>
@@ -1534,7 +1607,7 @@
                 <w:sz w:val="18"/>
                 <w:szCs w:val="18"/>
               </w:rPr>
-              <w:t xml:space="preserve">Direction is encoded two different ways</w:t>
+              <w:t xml:space="preserve">The "five exposure numbers" are not modeled</w:t>
             </w:r>
           </w:p>
         </w:tc>
@@ -1558,7 +1631,7 @@
                 <w:sz w:val="17"/>
                 <w:szCs w:val="17"/>
               </w:rPr>
-              <w:t xml:space="preserve">Most instruments derive direction from movementType via a static lookup table; B2 (EPLC_CONFIRMATION / AMEND) instead derives direction from the sign of the amount field itself — already a documented source of one real bug (a sign-negation patch that mutated the shared model object).</w:t>
+              <w:t xml:space="preserve">No trace of accounting_balance / ead_economic / ecl_ead / ead_regulatory / limit_utilisation as distinct figures anywhere in the component; it only produces accounting-balance-family figures (confirmedBalance, availableBalance, offBalanceExposure, tightAvailableBalance).</w:t>
             </w:r>
           </w:p>
           <w:p>
@@ -1573,7 +1646,7 @@
                 <w:sz w:val="17"/>
                 <w:szCs w:val="17"/>
               </w:rPr>
-              <w:t xml:space="preserve">Two mechanisms for the same concept increase the risk of the direction and the magnitude drifting out of sync, and make the rule harder to audit.</w:t>
+              <w:t xml:space="preserve">Reasonable if this is a deliberate boundary decision (ECL and regulatory EAD genuinely belong to a risk engine), but right now it reads as an implicit gap rather than a recorded scope decision.</w:t>
             </w:r>
           </w:p>
         </w:tc>
@@ -1597,7 +1670,7 @@
                 <w:sz w:val="18"/>
                 <w:szCs w:val="18"/>
               </w:rPr>
-              <w:t xml:space="preserve">Standardize on one direction mechanism, or document the B2 exception prominently at the API-contract level.</w:t>
+              <w:t xml:space="preserve">Record explicitly, in the scope documentation, that ECL/regulatory-EAD derivation is entirely a downstream consumer's responsibility.</w:t>
             </w:r>
           </w:p>
         </w:tc>
@@ -1659,7 +1732,7 @@
                 <w:sz w:val="18"/>
                 <w:szCs w:val="18"/>
               </w:rPr>
-              <w:t xml:space="preserve">The "five exposure numbers" are not modeled</w:t>
+              <w:t xml:space="preserve">Test matrix has no expiry, Art. 16(f), or double-count scenarios</w:t>
             </w:r>
           </w:p>
         </w:tc>
@@ -1683,7 +1756,7 @@
                 <w:sz w:val="17"/>
                 <w:szCs w:val="17"/>
               </w:rPr>
-              <w:t xml:space="preserve">No trace of accounting_balance / ead_economic / ecl_ead / ead_regulatory / limit_utilisation as distinct figures anywhere in the component; it only produces accounting-balance-family figures (confirmedBalance, availableBalance, offBalanceExposure, tightAvailableBalance).</w:t>
+              <w:t xml:space="preserve">The 23-case live business-case registry (grown from 14) does not exercise expiry release, Art. 16(f) preclusion, or exposure double-counting — consistent with F1 not existing yet, but a distinct gap once it is built.</w:t>
             </w:r>
           </w:p>
           <w:p>
@@ -1698,7 +1771,7 @@
                 <w:sz w:val="17"/>
                 <w:szCs w:val="17"/>
               </w:rPr>
-              <w:t xml:space="preserve">Reasonable if this is a deliberate boundary decision (ECL and regulatory EAD genuinely belong to a risk engine), but right now it reads as an implicit gap rather than a recorded scope decision.</w:t>
+              <w:t xml:space="preserve">The domain rules with the highest historical defect rate elsewhere in trade finance ledgers are exactly the ones currently untested here.</w:t>
             </w:r>
           </w:p>
         </w:tc>
@@ -1722,7 +1795,7 @@
                 <w:sz w:val="18"/>
                 <w:szCs w:val="18"/>
               </w:rPr>
-              <w:t xml:space="preserve">Record explicitly, in the scope documentation, that ECL/regulatory-EAD derivation is entirely a downstream consumer's responsibility.</w:t>
+              <w:t xml:space="preserve">Add these scenarios to the Test-Case-Proposal as soon as F1 lands.</w:t>
             </w:r>
           </w:p>
         </w:tc>
@@ -1784,7 +1857,7 @@
                 <w:sz w:val="18"/>
                 <w:szCs w:val="18"/>
               </w:rPr>
-              <w:t xml:space="preserve">Test matrix has no expiry, Art. 16(f), or double-count scenarios</w:t>
+              <w:t xml:space="preserve">balance_movements has grown to 47 sparse columns</w:t>
             </w:r>
           </w:p>
         </w:tc>
@@ -1808,7 +1881,7 @@
                 <w:sz w:val="17"/>
                 <w:szCs w:val="17"/>
               </w:rPr>
-              <w:t xml:space="preserve">The 23-case live business-case registry (grown from 14) does not exercise expiry release, Art. 16(f) preclusion, or exposure double-counting — consistent with F1 not existing yet, but a distinct gap once it is built.</w:t>
+              <w:t xml:space="preserve">Repeated ALTER TABLE additions (one actor/timestamp column pair per new operation) rather than a normalized event table; a backdated-correction decision table already exists in the design spec with no corresponding effective_date / booking_date / period-close columns implemented.</w:t>
             </w:r>
           </w:p>
           <w:p>
@@ -1823,7 +1896,7 @@
                 <w:sz w:val="17"/>
                 <w:szCs w:val="17"/>
               </w:rPr>
-              <w:t xml:space="preserve">The domain rules with the highest historical defect rate elsewhere in trade finance ledgers are exactly the ones currently untested here.</w:t>
+              <w:t xml:space="preserve">Flagged by the project's own DB-optimization review as technical debt; makes the ledger harder to extend cleanly and defers period-versioning indefinitely.</w:t>
             </w:r>
           </w:p>
         </w:tc>
@@ -1847,7 +1920,7 @@
                 <w:sz w:val="18"/>
                 <w:szCs w:val="18"/>
               </w:rPr>
-              <w:t xml:space="preserve">Add these scenarios to the Test-Case-Proposal as soon as F1 lands.</w:t>
+              <w:t xml:space="preserve">Normalize into movement_actions / movement_snapshots per the project's own recommendation, ideally alongside the already-planned Postgres migration.</w:t>
             </w:r>
           </w:p>
         </w:tc>
@@ -1869,11 +1942,11 @@
               <w:rPr>
                 <w:b/>
                 <w:bCs/>
-                <w:color w:val="E5A825"/>
-                <w:sz w:val="17"/>
-                <w:szCs w:val="17"/>
-              </w:rPr>
-              <w:t xml:space="preserve">MEDIUM</w:t>
+                <w:color w:val="6E8B3D"/>
+                <w:sz w:val="17"/>
+                <w:szCs w:val="17"/>
+              </w:rPr>
+              <w:t xml:space="preserve">LOW</w:t>
             </w:r>
           </w:p>
           <w:p>
@@ -1909,7 +1982,7 @@
                 <w:sz w:val="18"/>
                 <w:szCs w:val="18"/>
               </w:rPr>
-              <w:t xml:space="preserve">balance_movements has grown to 47 sparse columns</w:t>
+              <w:t xml:space="preserve">Re-ISSUE path may bypass the duplicate-ISSUE guard</w:t>
             </w:r>
           </w:p>
         </w:tc>
@@ -1933,7 +2006,7 @@
                 <w:sz w:val="17"/>
                 <w:szCs w:val="17"/>
               </w:rPr>
-              <w:t xml:space="preserve">Repeated ALTER TABLE additions (one actor/timestamp column pair per new operation) rather than a normalized event table; a backdated-correction decision table already exists in the design spec with no corresponding effective_date / booking_date / period-close columns implemented.</w:t>
+              <w:t xml:space="preserve">A balanceContractId-keyed re-ISSUE path does not obviously call the same duplicate-ISSUE guard and assertRootIssueReleased check the natural-key path uses; flagged untested by the project's own adversarial review.</w:t>
             </w:r>
           </w:p>
           <w:p>
@@ -1948,7 +2021,7 @@
                 <w:sz w:val="17"/>
                 <w:szCs w:val="17"/>
               </w:rPr>
-              <w:t xml:space="preserve">Flagged by the project's own DB-optimization review as technical debt; makes the ledger harder to extend cleanly and defers period-versioning indefinitely.</w:t>
+              <w:t xml:space="preserve">Plausible, low-probability double-count vector.</w:t>
             </w:r>
           </w:p>
         </w:tc>
@@ -1972,7 +2045,7 @@
                 <w:sz w:val="18"/>
                 <w:szCs w:val="18"/>
               </w:rPr>
-              <w:t xml:space="preserve">Normalize into movement_actions / movement_snapshots per the project's own recommendation, ideally alongside the already-planned Postgres migration.</w:t>
+              <w:t xml:space="preserve">Add a regression test, or retire the second path if it is not actually needed.</w:t>
             </w:r>
           </w:p>
         </w:tc>
@@ -2034,7 +2107,7 @@
                 <w:sz w:val="18"/>
                 <w:szCs w:val="18"/>
               </w:rPr>
-              <w:t xml:space="preserve">Re-ISSUE path may bypass the duplicate-ISSUE guard</w:t>
+              <w:t xml:space="preserve">Designed contract-version chain is unused</w:t>
             </w:r>
           </w:p>
         </w:tc>
@@ -2058,7 +2131,7 @@
                 <w:sz w:val="17"/>
                 <w:szCs w:val="17"/>
               </w:rPr>
-              <w:t xml:space="preserve">A balanceContractId-keyed re-ISSUE path does not obviously call the same duplicate-ISSUE guard and assertRootIssueReleased check the natural-key path uses; flagged untested by the project's own adversarial review.</w:t>
+              <w:t xml:space="preserve">DB design doc describes markSuperseded / contractVersion; balanceService.ts hardcodes contractVersion: 1 and never calls it.</w:t>
             </w:r>
           </w:p>
           <w:p>
@@ -2073,7 +2146,7 @@
                 <w:sz w:val="17"/>
                 <w:szCs w:val="17"/>
               </w:rPr>
-              <w:t xml:space="preserve">Plausible, low-probability double-count vector.</w:t>
+              <w:t xml:space="preserve">Dead schema vs. an unfinished feature — ambiguous which, but low risk either way.</w:t>
             </w:r>
           </w:p>
         </w:tc>
@@ -2097,7 +2170,7 @@
                 <w:sz w:val="18"/>
                 <w:szCs w:val="18"/>
               </w:rPr>
-              <w:t xml:space="preserve">Add a regression test, or retire the second path if it is not actually needed.</w:t>
+              <w:t xml:space="preserve">Record a documentation decision: implement it, or remove it from the design doc.</w:t>
             </w:r>
           </w:p>
         </w:tc>
@@ -2159,7 +2232,7 @@
                 <w:sz w:val="18"/>
                 <w:szCs w:val="18"/>
               </w:rPr>
-              <w:t xml:space="preserve">Designed contract-version chain is unused</w:t>
+              <w:t xml:space="preserve">reject() derives checkerId differently from release()</w:t>
             </w:r>
           </w:p>
         </w:tc>
@@ -2183,7 +2256,7 @@
                 <w:sz w:val="17"/>
                 <w:szCs w:val="17"/>
               </w:rPr>
-              <w:t xml:space="preserve">DB design doc describes markSuperseded / contractVersion; balanceService.ts hardcodes contractVersion: 1 and never calls it.</w:t>
+              <w:t xml:space="preserve">reject() uses a hardcoded checkerId; release() derives it through the normal mechanism.</w:t>
             </w:r>
           </w:p>
           <w:p>
@@ -2198,7 +2271,7 @@
                 <w:sz w:val="17"/>
                 <w:szCs w:val="17"/>
               </w:rPr>
-              <w:t xml:space="preserve">Dead schema vs. an unfinished feature — ambiguous which, but low risk either way.</w:t>
+              <w:t xml:space="preserve">Minor audit-trail inconsistency between the two Checker actions.</w:t>
             </w:r>
           </w:p>
         </w:tc>
@@ -2222,7 +2295,7 @@
                 <w:sz w:val="18"/>
                 <w:szCs w:val="18"/>
               </w:rPr>
-              <w:t xml:space="preserve">Record a documentation decision: implement it, or remove it from the design doc.</w:t>
+              <w:t xml:space="preserve">Align the two code paths.</w:t>
             </w:r>
           </w:p>
         </w:tc>
@@ -2259,131 +2332,6 @@
                 <w:szCs w:val="16"/>
               </w:rPr>
               <w:t xml:space="preserve">F15</w:t>
-            </w:r>
-          </w:p>
-        </w:tc>
-        <w:tc>
-          <w:tcPr>
-            <w:tcW w:type="dxa" w:w="2600"/>
-            <w:tcMar>
-              <w:top w:type="dxa" w:w="80"/>
-              <w:left w:type="dxa" w:w="100"/>
-              <w:bottom w:type="dxa" w:w="80"/>
-              <w:right w:type="dxa" w:w="100"/>
-            </w:tcMar>
-            <w:vAlign w:val="top"/>
-          </w:tcPr>
-          <w:p>
-            <w:pPr>
-              <w:spacing w:line="260"/>
-            </w:pPr>
-            <w:r>
-              <w:rPr>
-                <w:b/>
-                <w:bCs/>
-                <w:sz w:val="18"/>
-                <w:szCs w:val="18"/>
-              </w:rPr>
-              <w:t xml:space="preserve">reject() derives checkerId differently from release()</w:t>
-            </w:r>
-          </w:p>
-        </w:tc>
-        <w:tc>
-          <w:tcPr>
-            <w:tcW w:type="dxa" w:w="3200"/>
-            <w:tcMar>
-              <w:top w:type="dxa" w:w="80"/>
-              <w:left w:type="dxa" w:w="100"/>
-              <w:bottom w:type="dxa" w:w="80"/>
-              <w:right w:type="dxa" w:w="100"/>
-            </w:tcMar>
-            <w:vAlign w:val="top"/>
-          </w:tcPr>
-          <w:p>
-            <w:pPr>
-              <w:spacing w:after="60" w:line="250"/>
-            </w:pPr>
-            <w:r>
-              <w:rPr>
-                <w:sz w:val="17"/>
-                <w:szCs w:val="17"/>
-              </w:rPr>
-              <w:t xml:space="preserve">reject() uses a hardcoded checkerId; release() derives it through the normal mechanism.</w:t>
-            </w:r>
-          </w:p>
-          <w:p>
-            <w:pPr>
-              <w:spacing w:line="250"/>
-            </w:pPr>
-            <w:r>
-              <w:rPr>
-                <w:i/>
-                <w:iCs/>
-                <w:color w:val="555555"/>
-                <w:sz w:val="17"/>
-                <w:szCs w:val="17"/>
-              </w:rPr>
-              <w:t xml:space="preserve">Minor audit-trail inconsistency between the two Checker actions.</w:t>
-            </w:r>
-          </w:p>
-        </w:tc>
-        <w:tc>
-          <w:tcPr>
-            <w:tcW w:type="dxa" w:w="2900"/>
-            <w:tcMar>
-              <w:top w:type="dxa" w:w="80"/>
-              <w:left w:type="dxa" w:w="100"/>
-              <w:bottom w:type="dxa" w:w="80"/>
-              <w:right w:type="dxa" w:w="100"/>
-            </w:tcMar>
-            <w:vAlign w:val="top"/>
-          </w:tcPr>
-          <w:p>
-            <w:pPr>
-              <w:spacing w:line="260"/>
-            </w:pPr>
-            <w:r>
-              <w:rPr>
-                <w:sz w:val="18"/>
-                <w:szCs w:val="18"/>
-              </w:rPr>
-              <w:t xml:space="preserve">Align the two code paths.</w:t>
-            </w:r>
-          </w:p>
-        </w:tc>
-      </w:tr>
-      <w:tr>
-        <w:tc>
-          <w:tcPr>
-            <w:tcW w:type="dxa" w:w="900"/>
-            <w:tcMar>
-              <w:top w:type="dxa" w:w="80"/>
-              <w:left w:type="dxa" w:w="100"/>
-              <w:bottom w:type="dxa" w:w="80"/>
-              <w:right w:type="dxa" w:w="100"/>
-            </w:tcMar>
-            <w:vAlign w:val="top"/>
-          </w:tcPr>
-          <w:p>
-            <w:r>
-              <w:rPr>
-                <w:b/>
-                <w:bCs/>
-                <w:color w:val="6E8B3D"/>
-                <w:sz w:val="17"/>
-                <w:szCs w:val="17"/>
-              </w:rPr>
-              <w:t xml:space="preserve">LOW</w:t>
-            </w:r>
-          </w:p>
-          <w:p>
-            <w:r>
-              <w:rPr>
-                <w:color w:val="777777"/>
-                <w:sz w:val="16"/>
-                <w:szCs w:val="16"/>
-              </w:rPr>
-              <w:t xml:space="preserve">F16</w:t>
             </w:r>
           </w:p>
         </w:tc>
@@ -2515,7 +2463,7 @@
           <w:sz w:val="20"/>
           <w:szCs w:val="20"/>
         </w:rPr>
-        <w:t xml:space="preserve">23 live, end-to-end business cases (grown from a 14-case baseline), executed against the running stack rather than mocked, including negative/gate-condition paths. Coverage of the Close functions (A10 Import, B6 Export) and SG redemption (A9) is thorough and includes intentional rejection cases. As noted in F11, expiry release, Art. 16(f) preclusion, and exposure double-counting are not yet represented — largely because the underlying feature (F1) does not exist yet.</w:t>
+        <w:t xml:space="preserve">23 live, end-to-end business cases (grown from a 14-case baseline), executed against the running stack rather than mocked, including negative/gate-condition paths. Coverage of the Close functions (A10 Import, B6 Export) and SG redemption (A9) is thorough and includes intentional rejection cases. As noted in F10, expiry release, Art. 16(f) preclusion, and exposure double-counting are not yet represented — largely because the underlying feature (F1) does not exist yet.</w:t>
       </w:r>
     </w:p>
     <w:p>
@@ -2578,7 +2526,7 @@
           <w:sz w:val="20"/>
           <w:szCs w:val="20"/>
         </w:rPr>
-        <w:t xml:space="preserve">The project's own tracker records three deliberately deferred, explicit blockers: no authentication/authorization (F4), Angular pinned to a version carrying 8 high-severity CVEs, and SQLite's whole-file locking model, which needs to move to a row-level-concurrent database before production. None of the three have been started. This is a case of the team correctly knowing and stating what is not done, rather than a silent gap.</w:t>
+        <w:t xml:space="preserve">The project's own tracker records three deliberately deferred, explicit blockers: no authentication/authorization (F3), Angular pinned to a version carrying 8 high-severity CVEs, and SQLite's whole-file locking model, which needs to move to a row-level-concurrent database before production. None of the three have been started. This is a case of the team correctly knowing and stating what is not done, rather than a silent gap.</w:t>
       </w:r>
     </w:p>
     <w:p>
@@ -2614,7 +2562,7 @@
           <w:sz w:val="21"/>
           <w:szCs w:val="21"/>
         </w:rPr>
-        <w:t xml:space="preserve">Which document is authoritative on Acceptance/DPU treatment — the Folio 3/5 decision tables (shadow memo) or the balance-taxonomy workbook (on-balance-sheet)? (See F2.)</w:t>
+        <w:t xml:space="preserve">Is ECL / regulatory-EAD derivation intentionally entirely a downstream consumer's responsibility, and if so, where should that be recorded? (See F9.)</w:t>
       </w:r>
     </w:p>
     <w:p>
@@ -2631,7 +2579,7 @@
           <w:sz w:val="21"/>
           <w:szCs w:val="21"/>
         </w:rPr>
-        <w:t xml:space="preserve">Is Export Buyer's Usance rejection/normalization still planned as originally decided on 2026-08-21, or has the business scope changed since? (See F3.)</w:t>
+        <w:t xml:space="preserve">Is multi-currency/FX consolidation intentionally a future phase, or should it be pulled into this component's scope? (See F6.)</w:t>
       </w:r>
     </w:p>
     <w:p>
@@ -2648,40 +2596,6 @@
           <w:sz w:val="21"/>
           <w:szCs w:val="21"/>
         </w:rPr>
-        <w:t xml:space="preserve">Is ECL / regulatory-EAD derivation intentionally entirely a downstream consumer's responsibility, and if so, where should that be recorded? (See F10.)</w:t>
-      </w:r>
-    </w:p>
-    <w:p>
-      <w:pPr>
-        <w:pStyle w:val="ListParagraph"/>
-        <w:numPr>
-          <w:ilvl w:val="0"/>
-          <w:numId w:val="2"/>
-        </w:numPr>
-        <w:spacing w:after="100" w:line="270"/>
-      </w:pPr>
-      <w:r>
-        <w:rPr>
-          <w:sz w:val="21"/>
-          <w:szCs w:val="21"/>
-        </w:rPr>
-        <w:t xml:space="preserve">Is multi-currency/FX consolidation intentionally a future phase, or should it be pulled into this component's scope? (See F7.)</w:t>
-      </w:r>
-    </w:p>
-    <w:p>
-      <w:pPr>
-        <w:pStyle w:val="ListParagraph"/>
-        <w:numPr>
-          <w:ilvl w:val="0"/>
-          <w:numId w:val="2"/>
-        </w:numPr>
-        <w:spacing w:after="100" w:line="270"/>
-      </w:pPr>
-      <w:r>
-        <w:rPr>
-          <w:sz w:val="21"/>
-          <w:szCs w:val="21"/>
-        </w:rPr>
         <w:t xml:space="preserve">The A6 calculation-logic note states that "SHGT-style double-counting is out of scope" for the Off-Balance Exposure figure — does this mean a known SG double-counting risk exists and is being deliberately deferred, or is it just clarifying that this particular table doesn't need to re-derive SG logic? Worth a direct answer from whoever wrote that note.</w:t>
       </w:r>
     </w:p>
@@ -2713,7 +2627,7 @@
           <w:sz w:val="21"/>
           <w:szCs w:val="21"/>
         </w:rPr>
-        <w:t xml:space="preserve">Do not sign this off as production-ready — the project does not claim to be, and the three gated infrastructure blockers alone (F4, plus the Angular CVEs and SQLite locking) are sufficient reason on their own. As a design and business-rule foundation for continued build-out, however, this is in good shape: the boundary is correct, the core ledger mechanics (append-only, derived balances, real idempotency, enforced maker-checker) are sound, and the team's own documentation trail makes this an unusually easy component to review.</w:t>
+        <w:t xml:space="preserve">Do not sign this off as production-ready — the project does not claim to be, and the three gated infrastructure blockers alone (F3, plus the Angular CVEs and SQLite locking) are sufficient reason on their own. As a design and business-rule foundation for continued build-out, however, this is in good shape: the boundary is correct, the core ledger mechanics (append-only, derived balances, real idempotency, enforced maker-checker) are sound, and the team's own documentation trail makes this an unusually easy component to review.</w:t>
       </w:r>
     </w:p>
     <w:p>
@@ -2725,7 +2639,7 @@
           <w:sz w:val="21"/>
           <w:szCs w:val="21"/>
         </w:rPr>
-        <w:t xml:space="preserve">Before the next phase of work, I would prioritize F1 (expiry/Art. 16(f) auto-release) and F2 (Acceptance/DPU on-balance-sheet vs. shadow-memo contradiction) above all else — both are accounting-correctness questions, not engineering-effort questions, and both compound the longer they stay open. F3 (Export Buyer's Usance) is a BA action item from three weeks ago that simply needs to be closed one way or the other. The Medium and Low findings are worth a backlog entry each but do not block continued development.</w:t>
+        <w:t xml:space="preserve">Before the next phase of work, I would prioritize F1 (expiry/Art. 16(f) auto-release) above all else — it is an accounting-correctness question, not an engineering-effort question, and it compounds the longer it stays open. F2 (Export Buyer's Usance) has no remaining ambiguity to resolve — the decision was made on 2026-08-21 — so it should move straight into the engineering backlog rather than sit as if it were still awaiting a call. The Medium and Low findings are worth a backlog entry each but do not block continued development.</w:t>
       </w:r>
     </w:p>
     <w:sectPr>

</xml_diff>